<commit_message>
điều chỉnh phần cập nhật trạng thái
</commit_message>
<xml_diff>
--- a/DacTaBaiToan/Fix lỗi UI chọn file chuyen trang thai.docx
+++ b/DacTaBaiToan/Fix lỗi UI chọn file chuyen trang thai.docx
@@ -8,10 +8,10 @@
           <w:noProof/>
         </w:rPr>
         <w:drawing>
-          <wp:inline distT="0" distB="0" distL="0" distR="0" wp14:anchorId="1766DCFF" wp14:editId="34FEE2F7">
-            <wp:extent cx="5943600" cy="3004185"/>
-            <wp:effectExtent l="0" t="0" r="0" b="5715"/>
-            <wp:docPr id="1247494354" name="Picture 1"/>
+          <wp:inline distT="0" distB="0" distL="0" distR="0" wp14:anchorId="078AFF7F" wp14:editId="069D4CA0">
+            <wp:extent cx="5943600" cy="1767840"/>
+            <wp:effectExtent l="0" t="0" r="0" b="3810"/>
+            <wp:docPr id="1937845566" name="Picture 1"/>
             <wp:cNvGraphicFramePr>
               <a:graphicFrameLocks xmlns:a="http://schemas.openxmlformats.org/drawingml/2006/main" noChangeAspect="1"/>
             </wp:cNvGraphicFramePr>
@@ -19,7 +19,7 @@
               <a:graphicData uri="http://schemas.openxmlformats.org/drawingml/2006/picture">
                 <pic:pic xmlns:pic="http://schemas.openxmlformats.org/drawingml/2006/picture">
                   <pic:nvPicPr>
-                    <pic:cNvPr id="1247494354" name=""/>
+                    <pic:cNvPr id="1937845566" name=""/>
                     <pic:cNvPicPr/>
                   </pic:nvPicPr>
                   <pic:blipFill>
@@ -31,7 +31,7 @@
                   <pic:spPr>
                     <a:xfrm>
                       <a:off x="0" y="0"/>
-                      <a:ext cx="5943600" cy="3004185"/>
+                      <a:ext cx="5943600" cy="1767840"/>
                     </a:xfrm>
                     <a:prstGeom prst="rect">
                       <a:avLst/>
@@ -46,116 +46,7 @@
     </w:p>
     <w:p>
       <w:r>
-        <w:t xml:space="preserve">Fix </w:t>
-      </w:r>
-      <w:proofErr w:type="spellStart"/>
-      <w:r>
-        <w:t>lỗi</w:t>
-      </w:r>
-      <w:proofErr w:type="spellEnd"/>
-      <w:r>
-        <w:t xml:space="preserve"> UI </w:t>
-      </w:r>
-      <w:proofErr w:type="spellStart"/>
-      <w:r>
-        <w:t>chọn</w:t>
-      </w:r>
-      <w:proofErr w:type="spellEnd"/>
-      <w:r>
-        <w:t xml:space="preserve"> file, </w:t>
-      </w:r>
-      <w:proofErr w:type="spellStart"/>
-      <w:r>
-        <w:t>cho</w:t>
-      </w:r>
-      <w:proofErr w:type="spellEnd"/>
-      <w:r>
-        <w:t xml:space="preserve"> </w:t>
-      </w:r>
-      <w:proofErr w:type="spellStart"/>
-      <w:r>
-        <w:t>phép</w:t>
-      </w:r>
-      <w:proofErr w:type="spellEnd"/>
-      <w:r>
-        <w:t xml:space="preserve"> </w:t>
-      </w:r>
-      <w:proofErr w:type="spellStart"/>
-      <w:r>
-        <w:t>chọn</w:t>
-      </w:r>
-      <w:proofErr w:type="spellEnd"/>
-      <w:r>
-        <w:t xml:space="preserve"> </w:t>
-      </w:r>
-      <w:proofErr w:type="spellStart"/>
-      <w:r>
-        <w:t>nhiều</w:t>
-      </w:r>
-      <w:proofErr w:type="spellEnd"/>
-      <w:r>
-        <w:t xml:space="preserve"> file.</w:t>
-      </w:r>
-    </w:p>
-    <w:p>
-      <w:r>
-        <w:t xml:space="preserve">Khi </w:t>
-      </w:r>
-      <w:proofErr w:type="spellStart"/>
-      <w:r>
-        <w:t>lưu</w:t>
-      </w:r>
-      <w:proofErr w:type="spellEnd"/>
-      <w:r>
-        <w:t xml:space="preserve"> file </w:t>
-      </w:r>
-      <w:proofErr w:type="spellStart"/>
-      <w:r>
-        <w:t>thì</w:t>
-      </w:r>
-      <w:proofErr w:type="spellEnd"/>
-      <w:r>
-        <w:t xml:space="preserve"> </w:t>
-      </w:r>
-      <w:proofErr w:type="spellStart"/>
-      <w:r>
-        <w:t>lưu</w:t>
-      </w:r>
-      <w:proofErr w:type="spellEnd"/>
-      <w:r>
-        <w:t xml:space="preserve"> </w:t>
-      </w:r>
-      <w:proofErr w:type="spellStart"/>
-      <w:r>
-        <w:t>vào</w:t>
-      </w:r>
-      <w:proofErr w:type="spellEnd"/>
-      <w:r>
-        <w:t xml:space="preserve"> </w:t>
-      </w:r>
-      <w:proofErr w:type="spellStart"/>
-      <w:r>
-        <w:t>nội</w:t>
-      </w:r>
-      <w:proofErr w:type="spellEnd"/>
-      <w:r>
-        <w:t xml:space="preserve"> dung </w:t>
-      </w:r>
-      <w:proofErr w:type="spellStart"/>
-      <w:r>
-        <w:t>trao</w:t>
-      </w:r>
-      <w:proofErr w:type="spellEnd"/>
-      <w:r>
-        <w:t xml:space="preserve"> </w:t>
-      </w:r>
-      <w:proofErr w:type="spellStart"/>
-      <w:r>
-        <w:t>đổi</w:t>
-      </w:r>
-      <w:proofErr w:type="spellEnd"/>
-      <w:r>
-        <w:t>.</w:t>
+        <w:t>Chỗ này nếu có File đính kèm</w:t>
       </w:r>
     </w:p>
     <w:p>
@@ -164,10 +55,10 @@
           <w:noProof/>
         </w:rPr>
         <w:drawing>
-          <wp:inline distT="0" distB="0" distL="0" distR="0" wp14:anchorId="221FDF0F" wp14:editId="0AB6A403">
-            <wp:extent cx="5591175" cy="3013619"/>
-            <wp:effectExtent l="0" t="0" r="0" b="0"/>
-            <wp:docPr id="17884975" name="Picture 1"/>
+          <wp:inline distT="0" distB="0" distL="0" distR="0" wp14:anchorId="48A97C22" wp14:editId="71869EEA">
+            <wp:extent cx="5943600" cy="1504315"/>
+            <wp:effectExtent l="0" t="0" r="0" b="635"/>
+            <wp:docPr id="681863731" name="Picture 1"/>
             <wp:cNvGraphicFramePr>
               <a:graphicFrameLocks xmlns:a="http://schemas.openxmlformats.org/drawingml/2006/main" noChangeAspect="1"/>
             </wp:cNvGraphicFramePr>
@@ -175,7 +66,7 @@
               <a:graphicData uri="http://schemas.openxmlformats.org/drawingml/2006/picture">
                 <pic:pic xmlns:pic="http://schemas.openxmlformats.org/drawingml/2006/picture">
                   <pic:nvPicPr>
-                    <pic:cNvPr id="17884975" name=""/>
+                    <pic:cNvPr id="681863731" name=""/>
                     <pic:cNvPicPr/>
                   </pic:nvPicPr>
                   <pic:blipFill>
@@ -187,7 +78,7 @@
                   <pic:spPr>
                     <a:xfrm>
                       <a:off x="0" y="0"/>
-                      <a:ext cx="5593593" cy="3014922"/>
+                      <a:ext cx="5943600" cy="1504315"/>
                     </a:xfrm>
                     <a:prstGeom prst="rect">
                       <a:avLst/>
@@ -201,42 +92,25 @@
       </w:r>
     </w:p>
     <w:p>
-      <w:proofErr w:type="spellStart"/>
       <w:r>
-        <w:t>Bỏ</w:t>
+        <w:t>Thì đưa thông tin chuyển trạng thái này lên card phía trên luôn.</w:t>
       </w:r>
-      <w:proofErr w:type="spellEnd"/>
       <w:r>
-        <w:t xml:space="preserve"> </w:t>
-      </w:r>
-      <w:proofErr w:type="spellStart"/>
-      <w:r>
-        <w:t>nội</w:t>
-      </w:r>
-      <w:proofErr w:type="spellEnd"/>
-      <w:r>
-        <w:t xml:space="preserve"> dung </w:t>
-      </w:r>
-      <w:proofErr w:type="spellStart"/>
-      <w:r>
-        <w:t>này</w:t>
-      </w:r>
-      <w:proofErr w:type="spellEnd"/>
-      <w:r>
-        <w:t>.</w:t>
+        <w:br/>
+        <w:t>Chữ Thảo luận/Trao đổi thành Trạng thái</w:t>
       </w:r>
     </w:p>
+    <w:p/>
     <w:p>
       <w:r>
         <w:rPr>
           <w:noProof/>
         </w:rPr>
-        <w:lastRenderedPageBreak/>
         <w:drawing>
-          <wp:inline distT="0" distB="0" distL="0" distR="0" wp14:anchorId="5AF4210D" wp14:editId="50AAE42E">
-            <wp:extent cx="5943600" cy="3972560"/>
-            <wp:effectExtent l="0" t="0" r="0" b="8890"/>
-            <wp:docPr id="1686015879" name="Picture 1"/>
+          <wp:inline distT="0" distB="0" distL="0" distR="0" wp14:anchorId="173B5B55" wp14:editId="6A1F4FB3">
+            <wp:extent cx="5943600" cy="2028825"/>
+            <wp:effectExtent l="0" t="0" r="0" b="9525"/>
+            <wp:docPr id="672859879" name="Picture 1"/>
             <wp:cNvGraphicFramePr>
               <a:graphicFrameLocks xmlns:a="http://schemas.openxmlformats.org/drawingml/2006/main" noChangeAspect="1"/>
             </wp:cNvGraphicFramePr>
@@ -244,7 +118,7 @@
               <a:graphicData uri="http://schemas.openxmlformats.org/drawingml/2006/picture">
                 <pic:pic xmlns:pic="http://schemas.openxmlformats.org/drawingml/2006/picture">
                   <pic:nvPicPr>
-                    <pic:cNvPr id="1686015879" name=""/>
+                    <pic:cNvPr id="672859879" name=""/>
                     <pic:cNvPicPr/>
                   </pic:nvPicPr>
                   <pic:blipFill>
@@ -256,7 +130,7 @@
                   <pic:spPr>
                     <a:xfrm>
                       <a:off x="0" y="0"/>
-                      <a:ext cx="5943600" cy="3972560"/>
+                      <a:ext cx="5943600" cy="2028825"/>
                     </a:xfrm>
                     <a:prstGeom prst="rect">
                       <a:avLst/>
@@ -270,437 +144,19 @@
       </w:r>
     </w:p>
     <w:p>
-      <w:proofErr w:type="spellStart"/>
       <w:r>
-        <w:t>Nội</w:t>
+        <w:t>Đã đổi qua trạng thái mới và chọn quy trình nhưng khi bấm lưu không thấy hiển thị bên dưới danh sách checklist.</w:t>
       </w:r>
-      <w:proofErr w:type="spellEnd"/>
       <w:r>
-        <w:t xml:space="preserve"> dung </w:t>
+        <w:br/>
+        <w:t>Kiểm tra lại.</w:t>
       </w:r>
-      <w:proofErr w:type="spellStart"/>
-      <w:r>
-        <w:t>tiến</w:t>
-      </w:r>
-      <w:proofErr w:type="spellEnd"/>
+    </w:p>
+    <w:p>
       <w:r>
         <w:t xml:space="preserve"> </w:t>
       </w:r>
-      <w:proofErr w:type="spellStart"/>
-      <w:r>
-        <w:t>trình</w:t>
-      </w:r>
-      <w:proofErr w:type="spellEnd"/>
-      <w:r>
-        <w:t>.</w:t>
-      </w:r>
     </w:p>
-    <w:p>
-      <w:proofErr w:type="spellStart"/>
-      <w:r>
-        <w:t>Tên</w:t>
-      </w:r>
-      <w:proofErr w:type="spellEnd"/>
-      <w:r>
-        <w:t xml:space="preserve"> </w:t>
-      </w:r>
-      <w:proofErr w:type="spellStart"/>
-      <w:r>
-        <w:t>tiến</w:t>
-      </w:r>
-      <w:proofErr w:type="spellEnd"/>
-      <w:r>
-        <w:t xml:space="preserve"> </w:t>
-      </w:r>
-      <w:proofErr w:type="spellStart"/>
-      <w:r>
-        <w:t>trình</w:t>
-      </w:r>
-      <w:proofErr w:type="spellEnd"/>
-      <w:r>
-        <w:t xml:space="preserve"> – </w:t>
-      </w:r>
-      <w:proofErr w:type="spellStart"/>
-      <w:r>
-        <w:t>Textarea</w:t>
-      </w:r>
-      <w:proofErr w:type="spellEnd"/>
-      <w:r>
-        <w:t xml:space="preserve"> – </w:t>
-      </w:r>
-      <w:proofErr w:type="spellStart"/>
-      <w:r>
-        <w:t>Bắt</w:t>
-      </w:r>
-      <w:proofErr w:type="spellEnd"/>
-      <w:r>
-        <w:t xml:space="preserve"> </w:t>
-      </w:r>
-      <w:proofErr w:type="spellStart"/>
-      <w:r>
-        <w:t>buộc</w:t>
-      </w:r>
-      <w:proofErr w:type="spellEnd"/>
-    </w:p>
-    <w:p>
-      <w:proofErr w:type="spellStart"/>
-      <w:r>
-        <w:t>Số</w:t>
-      </w:r>
-      <w:proofErr w:type="spellEnd"/>
-      <w:r>
-        <w:t xml:space="preserve"> </w:t>
-      </w:r>
-      <w:proofErr w:type="spellStart"/>
-      <w:r>
-        <w:t>thứ</w:t>
-      </w:r>
-      <w:proofErr w:type="spellEnd"/>
-      <w:r>
-        <w:t xml:space="preserve"> </w:t>
-      </w:r>
-      <w:proofErr w:type="spellStart"/>
-      <w:r>
-        <w:t>tự</w:t>
-      </w:r>
-      <w:proofErr w:type="spellEnd"/>
-      <w:r>
-        <w:t xml:space="preserve"> - Input </w:t>
-      </w:r>
-      <w:proofErr w:type="spellStart"/>
-      <w:r>
-        <w:t>kiểu</w:t>
-      </w:r>
-      <w:proofErr w:type="spellEnd"/>
-      <w:r>
-        <w:t xml:space="preserve"> number – </w:t>
-      </w:r>
-      <w:proofErr w:type="spellStart"/>
-      <w:r>
-        <w:t>Bắt</w:t>
-      </w:r>
-      <w:proofErr w:type="spellEnd"/>
-      <w:r>
-        <w:t xml:space="preserve"> </w:t>
-      </w:r>
-      <w:proofErr w:type="spellStart"/>
-      <w:r>
-        <w:t>buộc</w:t>
-      </w:r>
-      <w:proofErr w:type="spellEnd"/>
-    </w:p>
-    <w:p>
-      <w:proofErr w:type="spellStart"/>
-      <w:r>
-        <w:t>Người</w:t>
-      </w:r>
-      <w:proofErr w:type="spellEnd"/>
-      <w:r>
-        <w:t xml:space="preserve"> </w:t>
-      </w:r>
-      <w:proofErr w:type="spellStart"/>
-      <w:r>
-        <w:t>thực</w:t>
-      </w:r>
-      <w:proofErr w:type="spellEnd"/>
-      <w:r>
-        <w:t xml:space="preserve"> </w:t>
-      </w:r>
-      <w:proofErr w:type="spellStart"/>
-      <w:r>
-        <w:t>hiện</w:t>
-      </w:r>
-      <w:proofErr w:type="spellEnd"/>
-      <w:r>
-        <w:t xml:space="preserve"> – </w:t>
-      </w:r>
-      <w:proofErr w:type="spellStart"/>
-      <w:r>
-        <w:t>Combobox</w:t>
-      </w:r>
-      <w:proofErr w:type="spellEnd"/>
-      <w:r>
-        <w:t xml:space="preserve"> – Danh </w:t>
-      </w:r>
-      <w:proofErr w:type="spellStart"/>
-      <w:r>
-        <w:t>sách</w:t>
-      </w:r>
-      <w:proofErr w:type="spellEnd"/>
-      <w:r>
-        <w:t xml:space="preserve"> </w:t>
-      </w:r>
-      <w:proofErr w:type="spellStart"/>
-      <w:r>
-        <w:t>những</w:t>
-      </w:r>
-      <w:proofErr w:type="spellEnd"/>
-      <w:r>
-        <w:t xml:space="preserve"> </w:t>
-      </w:r>
-      <w:proofErr w:type="spellStart"/>
-      <w:r>
-        <w:t>thành</w:t>
-      </w:r>
-      <w:proofErr w:type="spellEnd"/>
-      <w:r>
-        <w:t xml:space="preserve"> </w:t>
-      </w:r>
-      <w:proofErr w:type="spellStart"/>
-      <w:r>
-        <w:t>viên</w:t>
-      </w:r>
-      <w:proofErr w:type="spellEnd"/>
-      <w:r>
-        <w:t xml:space="preserve"> </w:t>
-      </w:r>
-      <w:proofErr w:type="spellStart"/>
-      <w:r>
-        <w:t>trong</w:t>
-      </w:r>
-      <w:proofErr w:type="spellEnd"/>
-      <w:r>
-        <w:t xml:space="preserve"> </w:t>
-      </w:r>
-      <w:proofErr w:type="spellStart"/>
-      <w:r>
-        <w:t>hồ</w:t>
-      </w:r>
-      <w:proofErr w:type="spellEnd"/>
-      <w:r>
-        <w:t xml:space="preserve"> </w:t>
-      </w:r>
-      <w:proofErr w:type="spellStart"/>
-      <w:r>
-        <w:t>sơ</w:t>
-      </w:r>
-      <w:proofErr w:type="spellEnd"/>
-      <w:r>
-        <w:t xml:space="preserve"> </w:t>
-      </w:r>
-      <w:proofErr w:type="spellStart"/>
-      <w:r>
-        <w:t>kinh</w:t>
-      </w:r>
-      <w:proofErr w:type="spellEnd"/>
-      <w:r>
-        <w:t xml:space="preserve"> </w:t>
-      </w:r>
-      <w:proofErr w:type="spellStart"/>
-      <w:r>
-        <w:t>doanh</w:t>
-      </w:r>
-      <w:proofErr w:type="spellEnd"/>
-      <w:r>
-        <w:t xml:space="preserve"> DVS – </w:t>
-      </w:r>
-      <w:proofErr w:type="spellStart"/>
-      <w:r>
-        <w:t>Không</w:t>
-      </w:r>
-      <w:proofErr w:type="spellEnd"/>
-      <w:r>
-        <w:t xml:space="preserve"> </w:t>
-      </w:r>
-      <w:proofErr w:type="spellStart"/>
-      <w:r>
-        <w:t>bắt</w:t>
-      </w:r>
-      <w:proofErr w:type="spellEnd"/>
-      <w:r>
-        <w:t xml:space="preserve"> </w:t>
-      </w:r>
-      <w:proofErr w:type="spellStart"/>
-      <w:r>
-        <w:t>buộc</w:t>
-      </w:r>
-      <w:proofErr w:type="spellEnd"/>
-    </w:p>
-    <w:p>
-      <w:proofErr w:type="spellStart"/>
-      <w:r>
-        <w:t>Ngày</w:t>
-      </w:r>
-      <w:proofErr w:type="spellEnd"/>
-      <w:r>
-        <w:t xml:space="preserve"> </w:t>
-      </w:r>
-      <w:proofErr w:type="spellStart"/>
-      <w:r>
-        <w:t>bắt</w:t>
-      </w:r>
-      <w:proofErr w:type="spellEnd"/>
-      <w:r>
-        <w:t xml:space="preserve"> </w:t>
-      </w:r>
-      <w:proofErr w:type="spellStart"/>
-      <w:r>
-        <w:t>đầu</w:t>
-      </w:r>
-      <w:proofErr w:type="spellEnd"/>
-      <w:r>
-        <w:t xml:space="preserve"> – </w:t>
-      </w:r>
-      <w:proofErr w:type="spellStart"/>
-      <w:r>
-        <w:t>Datetimepicker</w:t>
-      </w:r>
-      <w:proofErr w:type="spellEnd"/>
-      <w:r>
-        <w:t xml:space="preserve"> – </w:t>
-      </w:r>
-      <w:proofErr w:type="spellStart"/>
-      <w:r>
-        <w:t>Bắt</w:t>
-      </w:r>
-      <w:proofErr w:type="spellEnd"/>
-      <w:r>
-        <w:t xml:space="preserve"> </w:t>
-      </w:r>
-      <w:proofErr w:type="spellStart"/>
-      <w:r>
-        <w:t>buộc</w:t>
-      </w:r>
-      <w:proofErr w:type="spellEnd"/>
-    </w:p>
-    <w:p>
-      <w:proofErr w:type="spellStart"/>
-      <w:r>
-        <w:t>Số</w:t>
-      </w:r>
-      <w:proofErr w:type="spellEnd"/>
-      <w:r>
-        <w:t xml:space="preserve"> </w:t>
-      </w:r>
-      <w:proofErr w:type="spellStart"/>
-      <w:r>
-        <w:t>ngày</w:t>
-      </w:r>
-      <w:proofErr w:type="spellEnd"/>
-      <w:r>
-        <w:t xml:space="preserve"> </w:t>
-      </w:r>
-      <w:proofErr w:type="spellStart"/>
-      <w:r>
-        <w:t>thực</w:t>
-      </w:r>
-      <w:proofErr w:type="spellEnd"/>
-      <w:r>
-        <w:t xml:space="preserve"> </w:t>
-      </w:r>
-      <w:proofErr w:type="spellStart"/>
-      <w:r>
-        <w:t>hiện</w:t>
-      </w:r>
-      <w:proofErr w:type="spellEnd"/>
-      <w:r>
-        <w:t xml:space="preserve"> - </w:t>
-      </w:r>
-      <w:r>
-        <w:t xml:space="preserve">Input </w:t>
-      </w:r>
-      <w:proofErr w:type="spellStart"/>
-      <w:r>
-        <w:t>kiểu</w:t>
-      </w:r>
-      <w:proofErr w:type="spellEnd"/>
-      <w:r>
-        <w:t xml:space="preserve"> number – </w:t>
-      </w:r>
-      <w:proofErr w:type="spellStart"/>
-      <w:r>
-        <w:t>Bắt</w:t>
-      </w:r>
-      <w:proofErr w:type="spellEnd"/>
-      <w:r>
-        <w:t xml:space="preserve"> </w:t>
-      </w:r>
-      <w:proofErr w:type="spellStart"/>
-      <w:r>
-        <w:t>buộc</w:t>
-      </w:r>
-      <w:proofErr w:type="spellEnd"/>
-    </w:p>
-    <w:p>
-      <w:r>
-        <w:rPr>
-          <w:noProof/>
-        </w:rPr>
-        <w:lastRenderedPageBreak/>
-        <w:drawing>
-          <wp:inline distT="0" distB="0" distL="0" distR="0" wp14:anchorId="2829063E" wp14:editId="164A91AE">
-            <wp:extent cx="5943600" cy="3930650"/>
-            <wp:effectExtent l="0" t="0" r="0" b="0"/>
-            <wp:docPr id="1632950618" name="Picture 1"/>
-            <wp:cNvGraphicFramePr>
-              <a:graphicFrameLocks xmlns:a="http://schemas.openxmlformats.org/drawingml/2006/main" noChangeAspect="1"/>
-            </wp:cNvGraphicFramePr>
-            <a:graphic xmlns:a="http://schemas.openxmlformats.org/drawingml/2006/main">
-              <a:graphicData uri="http://schemas.openxmlformats.org/drawingml/2006/picture">
-                <pic:pic xmlns:pic="http://schemas.openxmlformats.org/drawingml/2006/picture">
-                  <pic:nvPicPr>
-                    <pic:cNvPr id="1632950618" name=""/>
-                    <pic:cNvPicPr/>
-                  </pic:nvPicPr>
-                  <pic:blipFill>
-                    <a:blip r:embed="rId7"/>
-                    <a:stretch>
-                      <a:fillRect/>
-                    </a:stretch>
-                  </pic:blipFill>
-                  <pic:spPr>
-                    <a:xfrm>
-                      <a:off x="0" y="0"/>
-                      <a:ext cx="5943600" cy="3930650"/>
-                    </a:xfrm>
-                    <a:prstGeom prst="rect">
-                      <a:avLst/>
-                    </a:prstGeom>
-                  </pic:spPr>
-                </pic:pic>
-              </a:graphicData>
-            </a:graphic>
-          </wp:inline>
-        </w:drawing>
-      </w:r>
-    </w:p>
-    <w:p>
-      <w:proofErr w:type="spellStart"/>
-      <w:r>
-        <w:t>Xác</w:t>
-      </w:r>
-      <w:proofErr w:type="spellEnd"/>
-      <w:r>
-        <w:t xml:space="preserve"> </w:t>
-      </w:r>
-      <w:proofErr w:type="spellStart"/>
-      <w:r>
-        <w:t>nhận</w:t>
-      </w:r>
-      <w:proofErr w:type="spellEnd"/>
-      <w:r>
-        <w:t xml:space="preserve"> </w:t>
-      </w:r>
-      <w:proofErr w:type="spellStart"/>
-      <w:r>
-        <w:t>chuyển</w:t>
-      </w:r>
-      <w:proofErr w:type="spellEnd"/>
-      <w:r>
-        <w:t xml:space="preserve"> – Lưu </w:t>
-      </w:r>
-      <w:proofErr w:type="spellStart"/>
-      <w:r>
-        <w:t>xuống</w:t>
-      </w:r>
-      <w:proofErr w:type="spellEnd"/>
-      <w:r>
-        <w:t xml:space="preserve"> checklist</w:t>
-      </w:r>
-    </w:p>
-    <w:p/>
-    <w:p/>
-    <w:p/>
     <w:sectPr>
       <w:pgSz w:w="12240" w:h="15840"/>
       <w:pgMar w:top="1440" w:right="1440" w:bottom="1440" w:left="1440" w:header="720" w:footer="720" w:gutter="0"/>

</xml_diff>

<commit_message>
fix(DigitalSales): remove Tiến trình & Checklist filter tab from activity stream
</commit_message>
<xml_diff>
--- a/DacTaBaiToan/Fix lỗi UI chọn file chuyen trang thai.docx
+++ b/DacTaBaiToan/Fix lỗi UI chọn file chuyen trang thai.docx
@@ -8,10 +8,10 @@
           <w:noProof/>
         </w:rPr>
         <w:drawing>
-          <wp:inline distT="0" distB="0" distL="0" distR="0" wp14:anchorId="078AFF7F" wp14:editId="069D4CA0">
-            <wp:extent cx="5943600" cy="1767840"/>
-            <wp:effectExtent l="0" t="0" r="0" b="3810"/>
-            <wp:docPr id="1937845566" name="Picture 1"/>
+          <wp:inline distT="0" distB="0" distL="0" distR="0" wp14:anchorId="3767BA98" wp14:editId="216E1850">
+            <wp:extent cx="5153025" cy="5334000"/>
+            <wp:effectExtent l="0" t="0" r="9525" b="0"/>
+            <wp:docPr id="187012502" name="Picture 1"/>
             <wp:cNvGraphicFramePr>
               <a:graphicFrameLocks xmlns:a="http://schemas.openxmlformats.org/drawingml/2006/main" noChangeAspect="1"/>
             </wp:cNvGraphicFramePr>
@@ -19,54 +19,7 @@
               <a:graphicData uri="http://schemas.openxmlformats.org/drawingml/2006/picture">
                 <pic:pic xmlns:pic="http://schemas.openxmlformats.org/drawingml/2006/picture">
                   <pic:nvPicPr>
-                    <pic:cNvPr id="1937845566" name=""/>
-                    <pic:cNvPicPr/>
-                  </pic:nvPicPr>
-                  <pic:blipFill>
-                    <a:blip r:embed="rId4"/>
-                    <a:stretch>
-                      <a:fillRect/>
-                    </a:stretch>
-                  </pic:blipFill>
-                  <pic:spPr>
-                    <a:xfrm>
-                      <a:off x="0" y="0"/>
-                      <a:ext cx="5943600" cy="1767840"/>
-                    </a:xfrm>
-                    <a:prstGeom prst="rect">
-                      <a:avLst/>
-                    </a:prstGeom>
-                  </pic:spPr>
-                </pic:pic>
-              </a:graphicData>
-            </a:graphic>
-          </wp:inline>
-        </w:drawing>
-      </w:r>
-    </w:p>
-    <w:p>
-      <w:r>
-        <w:t>Chỗ này nếu có File đính kèm</w:t>
-      </w:r>
-    </w:p>
-    <w:p>
-      <w:r>
-        <w:rPr>
-          <w:noProof/>
-        </w:rPr>
-        <w:drawing>
-          <wp:inline distT="0" distB="0" distL="0" distR="0" wp14:anchorId="48A97C22" wp14:editId="71869EEA">
-            <wp:extent cx="5943600" cy="1504315"/>
-            <wp:effectExtent l="0" t="0" r="0" b="635"/>
-            <wp:docPr id="681863731" name="Picture 1"/>
-            <wp:cNvGraphicFramePr>
-              <a:graphicFrameLocks xmlns:a="http://schemas.openxmlformats.org/drawingml/2006/main" noChangeAspect="1"/>
-            </wp:cNvGraphicFramePr>
-            <a:graphic xmlns:a="http://schemas.openxmlformats.org/drawingml/2006/main">
-              <a:graphicData uri="http://schemas.openxmlformats.org/drawingml/2006/picture">
-                <pic:pic xmlns:pic="http://schemas.openxmlformats.org/drawingml/2006/picture">
-                  <pic:nvPicPr>
-                    <pic:cNvPr id="681863731" name=""/>
+                    <pic:cNvPr id="187012502" name=""/>
                     <pic:cNvPicPr/>
                   </pic:nvPicPr>
                   <pic:blipFill>
@@ -78,7 +31,7 @@
                   <pic:spPr>
                     <a:xfrm>
                       <a:off x="0" y="0"/>
-                      <a:ext cx="5943600" cy="1504315"/>
+                      <a:ext cx="5153025" cy="5334000"/>
                     </a:xfrm>
                     <a:prstGeom prst="rect">
                       <a:avLst/>
@@ -92,71 +45,235 @@
       </w:r>
     </w:p>
     <w:p>
-      <w:r>
-        <w:t>Thì đưa thông tin chuyển trạng thái này lên card phía trên luôn.</w:t>
-      </w:r>
-      <w:r>
-        <w:br/>
-        <w:t>Chữ Thảo luận/Trao đổi thành Trạng thái</w:t>
+      <w:pPr>
+        <w:pStyle w:val="ListParagraph"/>
+        <w:numPr>
+          <w:ilvl w:val="0"/>
+          <w:numId w:val="1"/>
+        </w:numPr>
+      </w:pPr>
+      <w:r>
+        <w:t>Mã công việc: Được tạo tự động, Cấu trúc mã: CV26090000001</w:t>
+      </w:r>
+    </w:p>
+    <w:p>
+      <w:r>
+        <w:t xml:space="preserve">CV + YY + MM + </w:t>
+      </w:r>
+      <w:r>
+        <w:t xml:space="preserve"> </w:t>
+      </w:r>
+      <w:r>
+        <w:t>000000</w:t>
+      </w:r>
+      <w:r>
+        <w:t>x =&gt; Tăng tự động, mã này là duy nhất khi được insert vào table công việc của tiến trình.</w:t>
+      </w:r>
+    </w:p>
+    <w:p>
+      <w:pPr>
+        <w:pStyle w:val="ListParagraph"/>
+        <w:numPr>
+          <w:ilvl w:val="0"/>
+          <w:numId w:val="1"/>
+        </w:numPr>
+      </w:pPr>
+      <w:r>
+        <w:t>Tên công việc: Dùng Textarea</w:t>
+      </w:r>
+    </w:p>
+    <w:p>
+      <w:pPr>
+        <w:pStyle w:val="ListParagraph"/>
+        <w:numPr>
+          <w:ilvl w:val="0"/>
+          <w:numId w:val="1"/>
+        </w:numPr>
+      </w:pPr>
+      <w:r>
+        <w:t>Người Thực hiện: Danh sách người được add vào dự án/cơ hội</w:t>
+      </w:r>
+    </w:p>
+    <w:p>
+      <w:pPr>
+        <w:pStyle w:val="ListParagraph"/>
+        <w:numPr>
+          <w:ilvl w:val="0"/>
+          <w:numId w:val="1"/>
+        </w:numPr>
+      </w:pPr>
+      <w:r>
+        <w:t>Trạng thái: Chưa thực hiện/Đang thực hiện/Đã xong.</w:t>
+      </w:r>
+    </w:p>
+    <w:p>
+      <w:pPr>
+        <w:pStyle w:val="ListParagraph"/>
+        <w:numPr>
+          <w:ilvl w:val="0"/>
+          <w:numId w:val="1"/>
+        </w:numPr>
+      </w:pPr>
+      <w:r>
+        <w:t>Ngày bắt đầu: Datetimepicker</w:t>
+      </w:r>
+    </w:p>
+    <w:p>
+      <w:pPr>
+        <w:pStyle w:val="ListParagraph"/>
+        <w:numPr>
+          <w:ilvl w:val="0"/>
+          <w:numId w:val="1"/>
+        </w:numPr>
+      </w:pPr>
+      <w:r>
+        <w:t>Số ngày thực hiện: input number</w:t>
+      </w:r>
+    </w:p>
+    <w:p>
+      <w:pPr>
+        <w:pStyle w:val="ListParagraph"/>
+        <w:numPr>
+          <w:ilvl w:val="0"/>
+          <w:numId w:val="1"/>
+        </w:numPr>
+      </w:pPr>
+      <w:r>
+        <w:t>Hạn hoàn thành của công việc công không được vượt Hạn hoàn thành của Tiến trình</w:t>
+      </w:r>
+    </w:p>
+    <w:p>
+      <w:pPr>
+        <w:pStyle w:val="ListParagraph"/>
+        <w:numPr>
+          <w:ilvl w:val="0"/>
+          <w:numId w:val="1"/>
+        </w:numPr>
+      </w:pPr>
+      <w:r>
+        <w:t>Ghi chú: Textarea</w:t>
+      </w:r>
+    </w:p>
+    <w:p>
+      <w:pPr>
+        <w:pStyle w:val="ListParagraph"/>
+        <w:numPr>
+          <w:ilvl w:val="0"/>
+          <w:numId w:val="1"/>
+        </w:numPr>
+      </w:pPr>
+      <w:r>
+        <w:t>File đính kèm: Upload nhi</w:t>
+      </w:r>
+      <w:r>
+        <w:t>ều file.</w:t>
+      </w:r>
+    </w:p>
+    <w:p>
+      <w:pPr>
+        <w:ind w:left="360"/>
+      </w:pPr>
+      <w:r>
+        <w:lastRenderedPageBreak/>
+        <w:t>Khi thêm mới xong thì công việc thể hiện đầy đủ trên lưới danh sách.</w:t>
+      </w:r>
+    </w:p>
+    <w:p>
+      <w:pPr>
+        <w:ind w:left="360"/>
+      </w:pPr>
+    </w:p>
+    <w:p>
+      <w:pPr>
+        <w:ind w:left="360"/>
+      </w:pPr>
+      <w:r>
+        <w:t>2. Cập nhật thông tin công việc con.</w:t>
+      </w:r>
+    </w:p>
+    <w:p>
+      <w:pPr>
+        <w:ind w:left="360"/>
+      </w:pPr>
+      <w:r>
+        <w:t>-</w:t>
+      </w:r>
+      <w:r>
+        <w:tab/>
+        <w:t>Nếu công việc vẫn đang ở trạng thái là Chưa thực hiện/Đang thực hiện thì có phép cập nhật.</w:t>
+      </w:r>
+    </w:p>
+    <w:p>
+      <w:pPr>
+        <w:ind w:left="360"/>
+      </w:pPr>
+      <w:r>
+        <w:t>- Nội dung load lên phải đầy đủ giống thông tin Thêm mới.</w:t>
+      </w:r>
+    </w:p>
+    <w:p>
+      <w:pPr>
+        <w:ind w:left="360"/>
+      </w:pPr>
+      <w:r>
+        <w:t>- Đối với công việc ở Trạng thái Hoàn thành -&gt; Nếu muốn chỉnh sửa phải dùng chức năng Mở khóa -&gt; Và phải nhập lý do.</w:t>
+      </w:r>
+    </w:p>
+    <w:p>
+      <w:pPr>
+        <w:ind w:left="360"/>
+      </w:pPr>
+    </w:p>
+    <w:p>
+      <w:pPr>
+        <w:ind w:left="360"/>
+      </w:pPr>
+      <w:r>
+        <w:t>3. Xây dựng lịch sử thao tác Công việc.</w:t>
+      </w:r>
+    </w:p>
+    <w:p>
+      <w:pPr>
+        <w:ind w:left="360"/>
+      </w:pPr>
+      <w:r>
+        <w:t>Ở đây mở lên modal hi</w:t>
+      </w:r>
+      <w:r>
+        <w:t>ển thị lịch sử từ thêm mới, cập nhật nội dung nào, thay đổi từ nội dung A sang nội dung B, ai mở khóa.</w:t>
+      </w:r>
+    </w:p>
+    <w:p>
+      <w:pPr>
+        <w:ind w:left="360"/>
+      </w:pPr>
+    </w:p>
+    <w:p>
+      <w:pPr>
+        <w:ind w:left="360"/>
+      </w:pPr>
+      <w:r>
+        <w:t>4. Trên danh sách thì bổ sung thêm trạng thái xử lý ĐÚNG HẠN, TRỄ HẠN, CHƯA TỚI HẠN.</w:t>
+      </w:r>
+    </w:p>
+    <w:p>
+      <w:pPr>
+        <w:ind w:left="360"/>
+      </w:pPr>
+    </w:p>
+    <w:p>
+      <w:pPr>
+        <w:ind w:left="360"/>
+      </w:pPr>
+      <w:r>
+        <w:t xml:space="preserve">5. Front chữ làm sao cho cân </w:t>
+      </w:r>
+      <w:r>
+        <w:t>đối.</w:t>
       </w:r>
     </w:p>
     <w:p/>
-    <w:p>
-      <w:r>
-        <w:rPr>
-          <w:noProof/>
-        </w:rPr>
-        <w:drawing>
-          <wp:inline distT="0" distB="0" distL="0" distR="0" wp14:anchorId="173B5B55" wp14:editId="6A1F4FB3">
-            <wp:extent cx="5943600" cy="2028825"/>
-            <wp:effectExtent l="0" t="0" r="0" b="9525"/>
-            <wp:docPr id="672859879" name="Picture 1"/>
-            <wp:cNvGraphicFramePr>
-              <a:graphicFrameLocks xmlns:a="http://schemas.openxmlformats.org/drawingml/2006/main" noChangeAspect="1"/>
-            </wp:cNvGraphicFramePr>
-            <a:graphic xmlns:a="http://schemas.openxmlformats.org/drawingml/2006/main">
-              <a:graphicData uri="http://schemas.openxmlformats.org/drawingml/2006/picture">
-                <pic:pic xmlns:pic="http://schemas.openxmlformats.org/drawingml/2006/picture">
-                  <pic:nvPicPr>
-                    <pic:cNvPr id="672859879" name=""/>
-                    <pic:cNvPicPr/>
-                  </pic:nvPicPr>
-                  <pic:blipFill>
-                    <a:blip r:embed="rId6"/>
-                    <a:stretch>
-                      <a:fillRect/>
-                    </a:stretch>
-                  </pic:blipFill>
-                  <pic:spPr>
-                    <a:xfrm>
-                      <a:off x="0" y="0"/>
-                      <a:ext cx="5943600" cy="2028825"/>
-                    </a:xfrm>
-                    <a:prstGeom prst="rect">
-                      <a:avLst/>
-                    </a:prstGeom>
-                  </pic:spPr>
-                </pic:pic>
-              </a:graphicData>
-            </a:graphic>
-          </wp:inline>
-        </w:drawing>
-      </w:r>
-    </w:p>
-    <w:p>
-      <w:r>
-        <w:t>Đã đổi qua trạng thái mới và chọn quy trình nhưng khi bấm lưu không thấy hiển thị bên dưới danh sách checklist.</w:t>
-      </w:r>
-      <w:r>
-        <w:br/>
-        <w:t>Kiểm tra lại.</w:t>
-      </w:r>
-    </w:p>
-    <w:p>
-      <w:r>
-        <w:t xml:space="preserve"> </w:t>
-      </w:r>
-    </w:p>
+    <w:p/>
     <w:sectPr>
       <w:pgSz w:w="12240" w:h="15840"/>
       <w:pgMar w:top="1440" w:right="1440" w:bottom="1440" w:left="1440" w:header="720" w:footer="720" w:gutter="0"/>
@@ -165,6 +282,126 @@
     </w:sectPr>
   </w:body>
 </w:document>
+</file>
+
+<file path=word/numbering.xml><?xml version="1.0" encoding="utf-8"?>
+<w:numbering xmlns:wpc="http://schemas.microsoft.com/office/word/2010/wordprocessingCanvas" xmlns:cx="http://schemas.microsoft.com/office/drawing/2014/chartex" xmlns:cx1="http://schemas.microsoft.com/office/drawing/2015/9/8/chartex" xmlns:cx2="http://schemas.microsoft.com/office/drawing/2015/10/21/chartex" xmlns:cx3="http://schemas.microsoft.com/office/drawing/2016/5/9/chartex" xmlns:cx4="http://schemas.microsoft.com/office/drawing/2016/5/10/chartex" xmlns:cx5="http://schemas.microsoft.com/office/drawing/2016/5/11/chartex" xmlns:cx6="http://schemas.microsoft.com/office/drawing/2016/5/12/chartex" xmlns:cx7="http://schemas.microsoft.com/office/drawing/2016/5/13/chartex" xmlns:cx8="http://schemas.microsoft.com/office/drawing/2016/5/14/chartex" xmlns:mc="http://schemas.openxmlformats.org/markup-compatibility/2006" xmlns:aink="http://schemas.microsoft.com/office/drawing/2016/ink" xmlns:am3d="http://schemas.microsoft.com/office/drawing/2017/model3d" xmlns:o="urn:schemas-microsoft-com:office:office" xmlns:oel="http://schemas.microsoft.com/office/2019/extlst" xmlns:r="http://schemas.openxmlformats.org/officeDocument/2006/relationships" xmlns:m="http://schemas.openxmlformats.org/officeDocument/2006/math" xmlns:v="urn:schemas-microsoft-com:vml" xmlns:wp14="http://schemas.microsoft.com/office/word/2010/wordprocessingDrawing" xmlns:wp="http://schemas.openxmlformats.org/drawingml/2006/wordprocessingDrawing" xmlns:w10="urn:schemas-microsoft-com:office:word" xmlns:w="http://schemas.openxmlformats.org/wordprocessingml/2006/main" xmlns:w14="http://schemas.microsoft.com/office/word/2010/wordml" xmlns:w15="http://schemas.microsoft.com/office/word/2012/wordml" xmlns:w16cex="http://schemas.microsoft.com/office/word/2018/wordml/cex" xmlns:w16cid="http://schemas.microsoft.com/office/word/2016/wordml/cid" xmlns:w16="http://schemas.microsoft.com/office/word/2018/wordml" xmlns:w16du="http://schemas.microsoft.com/office/word/2023/wordml/word16du" xmlns:w16sdtdh="http://schemas.microsoft.com/office/word/2020/wordml/sdtdatahash" xmlns:w16sdtfl="http://schemas.microsoft.com/office/word/2024/wordml/sdtformatlock" xmlns:w16se="http://schemas.microsoft.com/office/word/2015/wordml/symex" xmlns:wpg="http://schemas.microsoft.com/office/word/2010/wordprocessingGroup" xmlns:wpi="http://schemas.microsoft.com/office/word/2010/wordprocessingInk" xmlns:wne="http://schemas.microsoft.com/office/word/2006/wordml" xmlns:wps="http://schemas.microsoft.com/office/word/2010/wordprocessingShape" mc:Ignorable="w14 w15 w16se w16cid w16 w16cex w16sdtdh w16sdtfl w16du wp14">
+  <w:abstractNum w:abstractNumId="0" w15:restartNumberingAfterBreak="0">
+    <w:nsid w:val="0C443287"/>
+    <w:multiLevelType w:val="hybridMultilevel"/>
+    <w:tmpl w:val="7C5C799A"/>
+    <w:lvl w:ilvl="0" w:tplc="D764914C">
+      <w:numFmt w:val="bullet"/>
+      <w:lvlText w:val="-"/>
+      <w:lvlJc w:val="left"/>
+      <w:pPr>
+        <w:ind w:left="720" w:hanging="360"/>
+      </w:pPr>
+      <w:rPr>
+        <w:rFonts w:ascii="Aptos" w:eastAsiaTheme="minorHAnsi" w:hAnsi="Aptos" w:cstheme="minorBidi" w:hint="default"/>
+      </w:rPr>
+    </w:lvl>
+    <w:lvl w:ilvl="1" w:tplc="04090003" w:tentative="1">
+      <w:start w:val="1"/>
+      <w:numFmt w:val="bullet"/>
+      <w:lvlText w:val="o"/>
+      <w:lvlJc w:val="left"/>
+      <w:pPr>
+        <w:ind w:left="1440" w:hanging="360"/>
+      </w:pPr>
+      <w:rPr>
+        <w:rFonts w:ascii="Courier New" w:hAnsi="Courier New" w:cs="Courier New" w:hint="default"/>
+      </w:rPr>
+    </w:lvl>
+    <w:lvl w:ilvl="2" w:tplc="04090005" w:tentative="1">
+      <w:start w:val="1"/>
+      <w:numFmt w:val="bullet"/>
+      <w:lvlText w:val=""/>
+      <w:lvlJc w:val="left"/>
+      <w:pPr>
+        <w:ind w:left="2160" w:hanging="360"/>
+      </w:pPr>
+      <w:rPr>
+        <w:rFonts w:ascii="Wingdings" w:hAnsi="Wingdings" w:hint="default"/>
+      </w:rPr>
+    </w:lvl>
+    <w:lvl w:ilvl="3" w:tplc="04090001" w:tentative="1">
+      <w:start w:val="1"/>
+      <w:numFmt w:val="bullet"/>
+      <w:lvlText w:val=""/>
+      <w:lvlJc w:val="left"/>
+      <w:pPr>
+        <w:ind w:left="2880" w:hanging="360"/>
+      </w:pPr>
+      <w:rPr>
+        <w:rFonts w:ascii="Symbol" w:hAnsi="Symbol" w:hint="default"/>
+      </w:rPr>
+    </w:lvl>
+    <w:lvl w:ilvl="4" w:tplc="04090003" w:tentative="1">
+      <w:start w:val="1"/>
+      <w:numFmt w:val="bullet"/>
+      <w:lvlText w:val="o"/>
+      <w:lvlJc w:val="left"/>
+      <w:pPr>
+        <w:ind w:left="3600" w:hanging="360"/>
+      </w:pPr>
+      <w:rPr>
+        <w:rFonts w:ascii="Courier New" w:hAnsi="Courier New" w:cs="Courier New" w:hint="default"/>
+      </w:rPr>
+    </w:lvl>
+    <w:lvl w:ilvl="5" w:tplc="04090005" w:tentative="1">
+      <w:start w:val="1"/>
+      <w:numFmt w:val="bullet"/>
+      <w:lvlText w:val=""/>
+      <w:lvlJc w:val="left"/>
+      <w:pPr>
+        <w:ind w:left="4320" w:hanging="360"/>
+      </w:pPr>
+      <w:rPr>
+        <w:rFonts w:ascii="Wingdings" w:hAnsi="Wingdings" w:hint="default"/>
+      </w:rPr>
+    </w:lvl>
+    <w:lvl w:ilvl="6" w:tplc="04090001" w:tentative="1">
+      <w:start w:val="1"/>
+      <w:numFmt w:val="bullet"/>
+      <w:lvlText w:val=""/>
+      <w:lvlJc w:val="left"/>
+      <w:pPr>
+        <w:ind w:left="5040" w:hanging="360"/>
+      </w:pPr>
+      <w:rPr>
+        <w:rFonts w:ascii="Symbol" w:hAnsi="Symbol" w:hint="default"/>
+      </w:rPr>
+    </w:lvl>
+    <w:lvl w:ilvl="7" w:tplc="04090003" w:tentative="1">
+      <w:start w:val="1"/>
+      <w:numFmt w:val="bullet"/>
+      <w:lvlText w:val="o"/>
+      <w:lvlJc w:val="left"/>
+      <w:pPr>
+        <w:ind w:left="5760" w:hanging="360"/>
+      </w:pPr>
+      <w:rPr>
+        <w:rFonts w:ascii="Courier New" w:hAnsi="Courier New" w:cs="Courier New" w:hint="default"/>
+      </w:rPr>
+    </w:lvl>
+    <w:lvl w:ilvl="8" w:tplc="04090005" w:tentative="1">
+      <w:start w:val="1"/>
+      <w:numFmt w:val="bullet"/>
+      <w:lvlText w:val=""/>
+      <w:lvlJc w:val="left"/>
+      <w:pPr>
+        <w:ind w:left="6480" w:hanging="360"/>
+      </w:pPr>
+      <w:rPr>
+        <w:rFonts w:ascii="Wingdings" w:hAnsi="Wingdings" w:hint="default"/>
+      </w:rPr>
+    </w:lvl>
+  </w:abstractNum>
+  <w:num w:numId="1" w16cid:durableId="558174121">
+    <w:abstractNumId w:val="0"/>
+  </w:num>
+</w:numbering>
 </file>
 
 <file path=word/styles.xml><?xml version="1.0" encoding="utf-8"?>

</xml_diff>

<commit_message>
feat(DigitalSales): complete Part 2 Checklist workflow, progress tracking, import, and unlock features
</commit_message>
<xml_diff>
--- a/DacTaBaiToan/Fix lỗi UI chọn file chuyen trang thai.docx
+++ b/DacTaBaiToan/Fix lỗi UI chọn file chuyen trang thai.docx
@@ -8,10 +8,10 @@
           <w:noProof/>
         </w:rPr>
         <w:drawing>
-          <wp:inline distT="0" distB="0" distL="0" distR="0" wp14:anchorId="3767BA98" wp14:editId="216E1850">
-            <wp:extent cx="5153025" cy="5334000"/>
-            <wp:effectExtent l="0" t="0" r="9525" b="0"/>
-            <wp:docPr id="187012502" name="Picture 1"/>
+          <wp:inline distT="0" distB="0" distL="0" distR="0" wp14:anchorId="4E88546F" wp14:editId="18326C90">
+            <wp:extent cx="5943600" cy="2423795"/>
+            <wp:effectExtent l="0" t="0" r="0" b="0"/>
+            <wp:docPr id="1183090946" name="Picture 1"/>
             <wp:cNvGraphicFramePr>
               <a:graphicFrameLocks xmlns:a="http://schemas.openxmlformats.org/drawingml/2006/main" noChangeAspect="1"/>
             </wp:cNvGraphicFramePr>
@@ -19,7 +19,7 @@
               <a:graphicData uri="http://schemas.openxmlformats.org/drawingml/2006/picture">
                 <pic:pic xmlns:pic="http://schemas.openxmlformats.org/drawingml/2006/picture">
                   <pic:nvPicPr>
-                    <pic:cNvPr id="187012502" name=""/>
+                    <pic:cNvPr id="1183090946" name=""/>
                     <pic:cNvPicPr/>
                   </pic:nvPicPr>
                   <pic:blipFill>
@@ -31,7 +31,107 @@
                   <pic:spPr>
                     <a:xfrm>
                       <a:off x="0" y="0"/>
-                      <a:ext cx="5153025" cy="5334000"/>
+                      <a:ext cx="5943600" cy="2423795"/>
+                    </a:xfrm>
+                    <a:prstGeom prst="rect">
+                      <a:avLst/>
+                    </a:prstGeom>
+                  </pic:spPr>
+                </pic:pic>
+              </a:graphicData>
+            </a:graphic>
+          </wp:inline>
+        </w:drawing>
+      </w:r>
+    </w:p>
+    <w:p/>
+    <w:p>
+      <w:r>
+        <w:t>Màn hình danh sách kinh doanh sản phẩm dịch vụ số.</w:t>
+      </w:r>
+    </w:p>
+    <w:p>
+      <w:r>
+        <w:t>1 – Sort -&gt; Sắp xếp theo ngày cập nhật gần nhất của Hồ sơ (Liên quan đến chuyển trạng thái, trao đổi, ….) =&gt; Mọi hành động thì đều lưu ngày ActionTime lại.</w:t>
+      </w:r>
+    </w:p>
+    <w:p>
+      <w:r>
+        <w:t>2 – Combobox Trạng thái thực hiện theo combobox giống Dự án. Cho phép chọn nhiều mặc định là chọn Tất cả, trừ những mã trạng thái được cấu hình trong Config.</w:t>
+      </w:r>
+      <w:r>
+        <w:rPr>
+          <w:noProof/>
+        </w:rPr>
+        <w:drawing>
+          <wp:inline distT="0" distB="0" distL="0" distR="0" wp14:anchorId="7A3A3B96" wp14:editId="45A6617D">
+            <wp:extent cx="5943600" cy="1819275"/>
+            <wp:effectExtent l="0" t="0" r="0" b="9525"/>
+            <wp:docPr id="1276712439" name="Picture 1"/>
+            <wp:cNvGraphicFramePr>
+              <a:graphicFrameLocks xmlns:a="http://schemas.openxmlformats.org/drawingml/2006/main" noChangeAspect="1"/>
+            </wp:cNvGraphicFramePr>
+            <a:graphic xmlns:a="http://schemas.openxmlformats.org/drawingml/2006/main">
+              <a:graphicData uri="http://schemas.openxmlformats.org/drawingml/2006/picture">
+                <pic:pic xmlns:pic="http://schemas.openxmlformats.org/drawingml/2006/picture">
+                  <pic:nvPicPr>
+                    <pic:cNvPr id="1276712439" name=""/>
+                    <pic:cNvPicPr/>
+                  </pic:nvPicPr>
+                  <pic:blipFill>
+                    <a:blip r:embed="rId6"/>
+                    <a:stretch>
+                      <a:fillRect/>
+                    </a:stretch>
+                  </pic:blipFill>
+                  <pic:spPr>
+                    <a:xfrm>
+                      <a:off x="0" y="0"/>
+                      <a:ext cx="5943600" cy="1819275"/>
+                    </a:xfrm>
+                    <a:prstGeom prst="rect">
+                      <a:avLst/>
+                    </a:prstGeom>
+                  </pic:spPr>
+                </pic:pic>
+              </a:graphicData>
+            </a:graphic>
+          </wp:inline>
+        </w:drawing>
+      </w:r>
+    </w:p>
+    <w:p/>
+    <w:p>
+      <w:r>
+        <w:rPr>
+          <w:noProof/>
+        </w:rPr>
+        <w:lastRenderedPageBreak/>
+        <w:drawing>
+          <wp:inline distT="0" distB="0" distL="0" distR="0" wp14:anchorId="45F8EB0D" wp14:editId="2B711883">
+            <wp:extent cx="5943600" cy="2468880"/>
+            <wp:effectExtent l="0" t="0" r="0" b="7620"/>
+            <wp:docPr id="775039073" name="Picture 1"/>
+            <wp:cNvGraphicFramePr>
+              <a:graphicFrameLocks xmlns:a="http://schemas.openxmlformats.org/drawingml/2006/main" noChangeAspect="1"/>
+            </wp:cNvGraphicFramePr>
+            <a:graphic xmlns:a="http://schemas.openxmlformats.org/drawingml/2006/main">
+              <a:graphicData uri="http://schemas.openxmlformats.org/drawingml/2006/picture">
+                <pic:pic xmlns:pic="http://schemas.openxmlformats.org/drawingml/2006/picture">
+                  <pic:nvPicPr>
+                    <pic:cNvPr id="775039073" name=""/>
+                    <pic:cNvPicPr/>
+                  </pic:nvPicPr>
+                  <pic:blipFill>
+                    <a:blip r:embed="rId7"/>
+                    <a:stretch>
+                      <a:fillRect/>
+                    </a:stretch>
+                  </pic:blipFill>
+                  <pic:spPr>
+                    <a:xfrm>
+                      <a:off x="0" y="0"/>
+                      <a:ext cx="5943600" cy="2468880"/>
                     </a:xfrm>
                     <a:prstGeom prst="rect">
                       <a:avLst/>
@@ -45,235 +145,15 @@
       </w:r>
     </w:p>
     <w:p>
-      <w:pPr>
-        <w:pStyle w:val="ListParagraph"/>
-        <w:numPr>
-          <w:ilvl w:val="0"/>
-          <w:numId w:val="1"/>
-        </w:numPr>
-      </w:pPr>
       <w:r>
-        <w:t>Mã công việc: Được tạo tự động, Cấu trúc mã: CV26090000001</w:t>
+        <w:t>Doanh thu dự kiến: Dựa trên tổng doanh thu dự kiến của các sản phẩm dịch vụ trong hồ sơ</w:t>
       </w:r>
     </w:p>
     <w:p>
       <w:r>
-        <w:t xml:space="preserve">CV + YY + MM + </w:t>
-      </w:r>
-      <w:r>
-        <w:t xml:space="preserve"> </w:t>
-      </w:r>
-      <w:r>
-        <w:t>000000</w:t>
-      </w:r>
-      <w:r>
-        <w:t>x =&gt; Tăng tự động, mã này là duy nhất khi được insert vào table công việc của tiến trình.</w:t>
+        <w:t>Doanh thu thực tế: Dựa trên tổng giá trị hợp hợp đồng của hồ sơ.</w:t>
       </w:r>
     </w:p>
-    <w:p>
-      <w:pPr>
-        <w:pStyle w:val="ListParagraph"/>
-        <w:numPr>
-          <w:ilvl w:val="0"/>
-          <w:numId w:val="1"/>
-        </w:numPr>
-      </w:pPr>
-      <w:r>
-        <w:t>Tên công việc: Dùng Textarea</w:t>
-      </w:r>
-    </w:p>
-    <w:p>
-      <w:pPr>
-        <w:pStyle w:val="ListParagraph"/>
-        <w:numPr>
-          <w:ilvl w:val="0"/>
-          <w:numId w:val="1"/>
-        </w:numPr>
-      </w:pPr>
-      <w:r>
-        <w:t>Người Thực hiện: Danh sách người được add vào dự án/cơ hội</w:t>
-      </w:r>
-    </w:p>
-    <w:p>
-      <w:pPr>
-        <w:pStyle w:val="ListParagraph"/>
-        <w:numPr>
-          <w:ilvl w:val="0"/>
-          <w:numId w:val="1"/>
-        </w:numPr>
-      </w:pPr>
-      <w:r>
-        <w:t>Trạng thái: Chưa thực hiện/Đang thực hiện/Đã xong.</w:t>
-      </w:r>
-    </w:p>
-    <w:p>
-      <w:pPr>
-        <w:pStyle w:val="ListParagraph"/>
-        <w:numPr>
-          <w:ilvl w:val="0"/>
-          <w:numId w:val="1"/>
-        </w:numPr>
-      </w:pPr>
-      <w:r>
-        <w:t>Ngày bắt đầu: Datetimepicker</w:t>
-      </w:r>
-    </w:p>
-    <w:p>
-      <w:pPr>
-        <w:pStyle w:val="ListParagraph"/>
-        <w:numPr>
-          <w:ilvl w:val="0"/>
-          <w:numId w:val="1"/>
-        </w:numPr>
-      </w:pPr>
-      <w:r>
-        <w:t>Số ngày thực hiện: input number</w:t>
-      </w:r>
-    </w:p>
-    <w:p>
-      <w:pPr>
-        <w:pStyle w:val="ListParagraph"/>
-        <w:numPr>
-          <w:ilvl w:val="0"/>
-          <w:numId w:val="1"/>
-        </w:numPr>
-      </w:pPr>
-      <w:r>
-        <w:t>Hạn hoàn thành của công việc công không được vượt Hạn hoàn thành của Tiến trình</w:t>
-      </w:r>
-    </w:p>
-    <w:p>
-      <w:pPr>
-        <w:pStyle w:val="ListParagraph"/>
-        <w:numPr>
-          <w:ilvl w:val="0"/>
-          <w:numId w:val="1"/>
-        </w:numPr>
-      </w:pPr>
-      <w:r>
-        <w:t>Ghi chú: Textarea</w:t>
-      </w:r>
-    </w:p>
-    <w:p>
-      <w:pPr>
-        <w:pStyle w:val="ListParagraph"/>
-        <w:numPr>
-          <w:ilvl w:val="0"/>
-          <w:numId w:val="1"/>
-        </w:numPr>
-      </w:pPr>
-      <w:r>
-        <w:t>File đính kèm: Upload nhi</w:t>
-      </w:r>
-      <w:r>
-        <w:t>ều file.</w:t>
-      </w:r>
-    </w:p>
-    <w:p>
-      <w:pPr>
-        <w:ind w:left="360"/>
-      </w:pPr>
-      <w:r>
-        <w:lastRenderedPageBreak/>
-        <w:t>Khi thêm mới xong thì công việc thể hiện đầy đủ trên lưới danh sách.</w:t>
-      </w:r>
-    </w:p>
-    <w:p>
-      <w:pPr>
-        <w:ind w:left="360"/>
-      </w:pPr>
-    </w:p>
-    <w:p>
-      <w:pPr>
-        <w:ind w:left="360"/>
-      </w:pPr>
-      <w:r>
-        <w:t>2. Cập nhật thông tin công việc con.</w:t>
-      </w:r>
-    </w:p>
-    <w:p>
-      <w:pPr>
-        <w:ind w:left="360"/>
-      </w:pPr>
-      <w:r>
-        <w:t>-</w:t>
-      </w:r>
-      <w:r>
-        <w:tab/>
-        <w:t>Nếu công việc vẫn đang ở trạng thái là Chưa thực hiện/Đang thực hiện thì có phép cập nhật.</w:t>
-      </w:r>
-    </w:p>
-    <w:p>
-      <w:pPr>
-        <w:ind w:left="360"/>
-      </w:pPr>
-      <w:r>
-        <w:t>- Nội dung load lên phải đầy đủ giống thông tin Thêm mới.</w:t>
-      </w:r>
-    </w:p>
-    <w:p>
-      <w:pPr>
-        <w:ind w:left="360"/>
-      </w:pPr>
-      <w:r>
-        <w:t>- Đối với công việc ở Trạng thái Hoàn thành -&gt; Nếu muốn chỉnh sửa phải dùng chức năng Mở khóa -&gt; Và phải nhập lý do.</w:t>
-      </w:r>
-    </w:p>
-    <w:p>
-      <w:pPr>
-        <w:ind w:left="360"/>
-      </w:pPr>
-    </w:p>
-    <w:p>
-      <w:pPr>
-        <w:ind w:left="360"/>
-      </w:pPr>
-      <w:r>
-        <w:t>3. Xây dựng lịch sử thao tác Công việc.</w:t>
-      </w:r>
-    </w:p>
-    <w:p>
-      <w:pPr>
-        <w:ind w:left="360"/>
-      </w:pPr>
-      <w:r>
-        <w:t>Ở đây mở lên modal hi</w:t>
-      </w:r>
-      <w:r>
-        <w:t>ển thị lịch sử từ thêm mới, cập nhật nội dung nào, thay đổi từ nội dung A sang nội dung B, ai mở khóa.</w:t>
-      </w:r>
-    </w:p>
-    <w:p>
-      <w:pPr>
-        <w:ind w:left="360"/>
-      </w:pPr>
-    </w:p>
-    <w:p>
-      <w:pPr>
-        <w:ind w:left="360"/>
-      </w:pPr>
-      <w:r>
-        <w:t>4. Trên danh sách thì bổ sung thêm trạng thái xử lý ĐÚNG HẠN, TRỄ HẠN, CHƯA TỚI HẠN.</w:t>
-      </w:r>
-    </w:p>
-    <w:p>
-      <w:pPr>
-        <w:ind w:left="360"/>
-      </w:pPr>
-    </w:p>
-    <w:p>
-      <w:pPr>
-        <w:ind w:left="360"/>
-      </w:pPr>
-      <w:r>
-        <w:t xml:space="preserve">5. Front chữ làm sao cho cân </w:t>
-      </w:r>
-      <w:r>
-        <w:t>đối.</w:t>
-      </w:r>
-    </w:p>
-    <w:p/>
-    <w:p/>
     <w:sectPr>
       <w:pgSz w:w="12240" w:h="15840"/>
       <w:pgMar w:top="1440" w:right="1440" w:bottom="1440" w:left="1440" w:header="720" w:footer="720" w:gutter="0"/>

</xml_diff>

<commit_message>
fix(digitalsales): triet de loi font tieng Viet mojibake AM chu tri kinh doanh va nguoi tao ho so
</commit_message>
<xml_diff>
--- a/DacTaBaiToan/Fix lỗi UI chọn file chuyen trang thai.docx
+++ b/DacTaBaiToan/Fix lỗi UI chọn file chuyen trang thai.docx
@@ -8,10 +8,10 @@
           <w:noProof/>
         </w:rPr>
         <w:drawing>
-          <wp:inline distT="0" distB="0" distL="0" distR="0" wp14:anchorId="4E88546F" wp14:editId="18326C90">
-            <wp:extent cx="5943600" cy="2423795"/>
-            <wp:effectExtent l="0" t="0" r="0" b="0"/>
-            <wp:docPr id="1183090946" name="Picture 1"/>
+          <wp:inline distT="0" distB="0" distL="0" distR="0" wp14:anchorId="727FFC90" wp14:editId="4B89DA4C">
+            <wp:extent cx="5943600" cy="2379980"/>
+            <wp:effectExtent l="0" t="0" r="0" b="1270"/>
+            <wp:docPr id="1064600448" name="Picture 1"/>
             <wp:cNvGraphicFramePr>
               <a:graphicFrameLocks xmlns:a="http://schemas.openxmlformats.org/drawingml/2006/main" noChangeAspect="1"/>
             </wp:cNvGraphicFramePr>
@@ -19,7 +19,7 @@
               <a:graphicData uri="http://schemas.openxmlformats.org/drawingml/2006/picture">
                 <pic:pic xmlns:pic="http://schemas.openxmlformats.org/drawingml/2006/picture">
                   <pic:nvPicPr>
-                    <pic:cNvPr id="1183090946" name=""/>
+                    <pic:cNvPr id="1064600448" name=""/>
                     <pic:cNvPicPr/>
                   </pic:nvPicPr>
                   <pic:blipFill>
@@ -31,63 +31,7 @@
                   <pic:spPr>
                     <a:xfrm>
                       <a:off x="0" y="0"/>
-                      <a:ext cx="5943600" cy="2423795"/>
-                    </a:xfrm>
-                    <a:prstGeom prst="rect">
-                      <a:avLst/>
-                    </a:prstGeom>
-                  </pic:spPr>
-                </pic:pic>
-              </a:graphicData>
-            </a:graphic>
-          </wp:inline>
-        </w:drawing>
-      </w:r>
-    </w:p>
-    <w:p/>
-    <w:p>
-      <w:r>
-        <w:t>Màn hình danh sách kinh doanh sản phẩm dịch vụ số.</w:t>
-      </w:r>
-    </w:p>
-    <w:p>
-      <w:r>
-        <w:t>1 – Sort -&gt; Sắp xếp theo ngày cập nhật gần nhất của Hồ sơ (Liên quan đến chuyển trạng thái, trao đổi, ….) =&gt; Mọi hành động thì đều lưu ngày ActionTime lại.</w:t>
-      </w:r>
-    </w:p>
-    <w:p>
-      <w:r>
-        <w:t>2 – Combobox Trạng thái thực hiện theo combobox giống Dự án. Cho phép chọn nhiều mặc định là chọn Tất cả, trừ những mã trạng thái được cấu hình trong Config.</w:t>
-      </w:r>
-      <w:r>
-        <w:rPr>
-          <w:noProof/>
-        </w:rPr>
-        <w:drawing>
-          <wp:inline distT="0" distB="0" distL="0" distR="0" wp14:anchorId="7A3A3B96" wp14:editId="45A6617D">
-            <wp:extent cx="5943600" cy="1819275"/>
-            <wp:effectExtent l="0" t="0" r="0" b="9525"/>
-            <wp:docPr id="1276712439" name="Picture 1"/>
-            <wp:cNvGraphicFramePr>
-              <a:graphicFrameLocks xmlns:a="http://schemas.openxmlformats.org/drawingml/2006/main" noChangeAspect="1"/>
-            </wp:cNvGraphicFramePr>
-            <a:graphic xmlns:a="http://schemas.openxmlformats.org/drawingml/2006/main">
-              <a:graphicData uri="http://schemas.openxmlformats.org/drawingml/2006/picture">
-                <pic:pic xmlns:pic="http://schemas.openxmlformats.org/drawingml/2006/picture">
-                  <pic:nvPicPr>
-                    <pic:cNvPr id="1276712439" name=""/>
-                    <pic:cNvPicPr/>
-                  </pic:nvPicPr>
-                  <pic:blipFill>
-                    <a:blip r:embed="rId6"/>
-                    <a:stretch>
-                      <a:fillRect/>
-                    </a:stretch>
-                  </pic:blipFill>
-                  <pic:spPr>
-                    <a:xfrm>
-                      <a:off x="0" y="0"/>
-                      <a:ext cx="5943600" cy="1819275"/>
+                      <a:ext cx="5943600" cy="2379980"/>
                     </a:xfrm>
                     <a:prstGeom prst="rect">
                       <a:avLst/>
@@ -106,12 +50,11 @@
         <w:rPr>
           <w:noProof/>
         </w:rPr>
-        <w:lastRenderedPageBreak/>
         <w:drawing>
-          <wp:inline distT="0" distB="0" distL="0" distR="0" wp14:anchorId="45F8EB0D" wp14:editId="2B711883">
-            <wp:extent cx="5943600" cy="2468880"/>
-            <wp:effectExtent l="0" t="0" r="0" b="7620"/>
-            <wp:docPr id="775039073" name="Picture 1"/>
+          <wp:inline distT="0" distB="0" distL="0" distR="0" wp14:anchorId="00835A09" wp14:editId="658A83CA">
+            <wp:extent cx="5943600" cy="3090545"/>
+            <wp:effectExtent l="0" t="0" r="0" b="0"/>
+            <wp:docPr id="135769622" name="Picture 1"/>
             <wp:cNvGraphicFramePr>
               <a:graphicFrameLocks xmlns:a="http://schemas.openxmlformats.org/drawingml/2006/main" noChangeAspect="1"/>
             </wp:cNvGraphicFramePr>
@@ -119,11 +62,11 @@
               <a:graphicData uri="http://schemas.openxmlformats.org/drawingml/2006/picture">
                 <pic:pic xmlns:pic="http://schemas.openxmlformats.org/drawingml/2006/picture">
                   <pic:nvPicPr>
-                    <pic:cNvPr id="775039073" name=""/>
+                    <pic:cNvPr id="135769622" name=""/>
                     <pic:cNvPicPr/>
                   </pic:nvPicPr>
                   <pic:blipFill>
-                    <a:blip r:embed="rId7"/>
+                    <a:blip r:embed="rId6"/>
                     <a:stretch>
                       <a:fillRect/>
                     </a:stretch>
@@ -131,7 +74,7 @@
                   <pic:spPr>
                     <a:xfrm>
                       <a:off x="0" y="0"/>
-                      <a:ext cx="5943600" cy="2468880"/>
+                      <a:ext cx="5943600" cy="3090545"/>
                     </a:xfrm>
                     <a:prstGeom prst="rect">
                       <a:avLst/>
@@ -145,13 +88,54 @@
       </w:r>
     </w:p>
     <w:p>
+      <w:pPr>
+        <w:pStyle w:val="ListParagraph"/>
+        <w:numPr>
+          <w:ilvl w:val="0"/>
+          <w:numId w:val="2"/>
+        </w:numPr>
+      </w:pPr>
       <w:r>
-        <w:t>Doanh thu dự kiến: Dựa trên tổng doanh thu dự kiến của các sản phẩm dịch vụ trong hồ sơ</w:t>
+        <w:t>Đã thực hiện xóa hết nhưng bấm xác nhận chuyển thì danh sách Tiến trình vẫn được insert vào checklist. Kiểm tra lại chỗ này gấp.</w:t>
       </w:r>
     </w:p>
     <w:p>
+      <w:pPr>
+        <w:pStyle w:val="ListParagraph"/>
+        <w:numPr>
+          <w:ilvl w:val="0"/>
+          <w:numId w:val="2"/>
+        </w:numPr>
+      </w:pPr>
       <w:r>
-        <w:t>Doanh thu thực tế: Dựa trên tổng giá trị hợp hợp đồng của hồ sơ.</w:t>
+        <w:t>Xây dựng chức năng Xóa Tất cả tiến trình.</w:t>
+      </w:r>
+    </w:p>
+    <w:p>
+      <w:pPr>
+        <w:pStyle w:val="ListParagraph"/>
+        <w:numPr>
+          <w:ilvl w:val="0"/>
+          <w:numId w:val="3"/>
+        </w:numPr>
+      </w:pPr>
+      <w:r>
+        <w:t>Bấm vào Xóa Tất cả tiến trình thì sẽ xóa hết Tiến trình trên danh sách.</w:t>
+      </w:r>
+    </w:p>
+    <w:p>
+      <w:pPr>
+        <w:pStyle w:val="ListParagraph"/>
+        <w:numPr>
+          <w:ilvl w:val="0"/>
+          <w:numId w:val="2"/>
+        </w:numPr>
+      </w:pPr>
+      <w:r>
+        <w:t>Bổ sung Ô Ghi chú trong ti</w:t>
+      </w:r>
+      <w:r>
+        <w:t>ến trình</w:t>
       </w:r>
     </w:p>
     <w:sectPr>
@@ -278,8 +262,216 @@
       </w:rPr>
     </w:lvl>
   </w:abstractNum>
+  <w:abstractNum w:abstractNumId="1" w15:restartNumberingAfterBreak="0">
+    <w:nsid w:val="2435463B"/>
+    <w:multiLevelType w:val="hybridMultilevel"/>
+    <w:tmpl w:val="F5FE9EA8"/>
+    <w:lvl w:ilvl="0" w:tplc="0409000F">
+      <w:start w:val="1"/>
+      <w:numFmt w:val="decimal"/>
+      <w:lvlText w:val="%1."/>
+      <w:lvlJc w:val="left"/>
+      <w:pPr>
+        <w:ind w:left="720" w:hanging="360"/>
+      </w:pPr>
+      <w:rPr>
+        <w:rFonts w:hint="default"/>
+      </w:rPr>
+    </w:lvl>
+    <w:lvl w:ilvl="1" w:tplc="04090019" w:tentative="1">
+      <w:start w:val="1"/>
+      <w:numFmt w:val="lowerLetter"/>
+      <w:lvlText w:val="%2."/>
+      <w:lvlJc w:val="left"/>
+      <w:pPr>
+        <w:ind w:left="1440" w:hanging="360"/>
+      </w:pPr>
+    </w:lvl>
+    <w:lvl w:ilvl="2" w:tplc="0409001B" w:tentative="1">
+      <w:start w:val="1"/>
+      <w:numFmt w:val="lowerRoman"/>
+      <w:lvlText w:val="%3."/>
+      <w:lvlJc w:val="right"/>
+      <w:pPr>
+        <w:ind w:left="2160" w:hanging="180"/>
+      </w:pPr>
+    </w:lvl>
+    <w:lvl w:ilvl="3" w:tplc="0409000F" w:tentative="1">
+      <w:start w:val="1"/>
+      <w:numFmt w:val="decimal"/>
+      <w:lvlText w:val="%4."/>
+      <w:lvlJc w:val="left"/>
+      <w:pPr>
+        <w:ind w:left="2880" w:hanging="360"/>
+      </w:pPr>
+    </w:lvl>
+    <w:lvl w:ilvl="4" w:tplc="04090019" w:tentative="1">
+      <w:start w:val="1"/>
+      <w:numFmt w:val="lowerLetter"/>
+      <w:lvlText w:val="%5."/>
+      <w:lvlJc w:val="left"/>
+      <w:pPr>
+        <w:ind w:left="3600" w:hanging="360"/>
+      </w:pPr>
+    </w:lvl>
+    <w:lvl w:ilvl="5" w:tplc="0409001B" w:tentative="1">
+      <w:start w:val="1"/>
+      <w:numFmt w:val="lowerRoman"/>
+      <w:lvlText w:val="%6."/>
+      <w:lvlJc w:val="right"/>
+      <w:pPr>
+        <w:ind w:left="4320" w:hanging="180"/>
+      </w:pPr>
+    </w:lvl>
+    <w:lvl w:ilvl="6" w:tplc="0409000F" w:tentative="1">
+      <w:start w:val="1"/>
+      <w:numFmt w:val="decimal"/>
+      <w:lvlText w:val="%7."/>
+      <w:lvlJc w:val="left"/>
+      <w:pPr>
+        <w:ind w:left="5040" w:hanging="360"/>
+      </w:pPr>
+    </w:lvl>
+    <w:lvl w:ilvl="7" w:tplc="04090019" w:tentative="1">
+      <w:start w:val="1"/>
+      <w:numFmt w:val="lowerLetter"/>
+      <w:lvlText w:val="%8."/>
+      <w:lvlJc w:val="left"/>
+      <w:pPr>
+        <w:ind w:left="5760" w:hanging="360"/>
+      </w:pPr>
+    </w:lvl>
+    <w:lvl w:ilvl="8" w:tplc="0409001B" w:tentative="1">
+      <w:start w:val="1"/>
+      <w:numFmt w:val="lowerRoman"/>
+      <w:lvlText w:val="%9."/>
+      <w:lvlJc w:val="right"/>
+      <w:pPr>
+        <w:ind w:left="6480" w:hanging="180"/>
+      </w:pPr>
+    </w:lvl>
+  </w:abstractNum>
+  <w:abstractNum w:abstractNumId="2" w15:restartNumberingAfterBreak="0">
+    <w:nsid w:val="315C4764"/>
+    <w:multiLevelType w:val="hybridMultilevel"/>
+    <w:tmpl w:val="0DDCF9D4"/>
+    <w:lvl w:ilvl="0" w:tplc="E8D6E50E">
+      <w:start w:val="2"/>
+      <w:numFmt w:val="bullet"/>
+      <w:lvlText w:val=""/>
+      <w:lvlJc w:val="left"/>
+      <w:pPr>
+        <w:ind w:left="720" w:hanging="360"/>
+      </w:pPr>
+      <w:rPr>
+        <w:rFonts w:ascii="Wingdings" w:eastAsiaTheme="minorHAnsi" w:hAnsi="Wingdings" w:cstheme="minorBidi" w:hint="default"/>
+      </w:rPr>
+    </w:lvl>
+    <w:lvl w:ilvl="1" w:tplc="04090003" w:tentative="1">
+      <w:start w:val="1"/>
+      <w:numFmt w:val="bullet"/>
+      <w:lvlText w:val="o"/>
+      <w:lvlJc w:val="left"/>
+      <w:pPr>
+        <w:ind w:left="1440" w:hanging="360"/>
+      </w:pPr>
+      <w:rPr>
+        <w:rFonts w:ascii="Courier New" w:hAnsi="Courier New" w:cs="Courier New" w:hint="default"/>
+      </w:rPr>
+    </w:lvl>
+    <w:lvl w:ilvl="2" w:tplc="04090005" w:tentative="1">
+      <w:start w:val="1"/>
+      <w:numFmt w:val="bullet"/>
+      <w:lvlText w:val=""/>
+      <w:lvlJc w:val="left"/>
+      <w:pPr>
+        <w:ind w:left="2160" w:hanging="360"/>
+      </w:pPr>
+      <w:rPr>
+        <w:rFonts w:ascii="Wingdings" w:hAnsi="Wingdings" w:hint="default"/>
+      </w:rPr>
+    </w:lvl>
+    <w:lvl w:ilvl="3" w:tplc="04090001" w:tentative="1">
+      <w:start w:val="1"/>
+      <w:numFmt w:val="bullet"/>
+      <w:lvlText w:val=""/>
+      <w:lvlJc w:val="left"/>
+      <w:pPr>
+        <w:ind w:left="2880" w:hanging="360"/>
+      </w:pPr>
+      <w:rPr>
+        <w:rFonts w:ascii="Symbol" w:hAnsi="Symbol" w:hint="default"/>
+      </w:rPr>
+    </w:lvl>
+    <w:lvl w:ilvl="4" w:tplc="04090003" w:tentative="1">
+      <w:start w:val="1"/>
+      <w:numFmt w:val="bullet"/>
+      <w:lvlText w:val="o"/>
+      <w:lvlJc w:val="left"/>
+      <w:pPr>
+        <w:ind w:left="3600" w:hanging="360"/>
+      </w:pPr>
+      <w:rPr>
+        <w:rFonts w:ascii="Courier New" w:hAnsi="Courier New" w:cs="Courier New" w:hint="default"/>
+      </w:rPr>
+    </w:lvl>
+    <w:lvl w:ilvl="5" w:tplc="04090005" w:tentative="1">
+      <w:start w:val="1"/>
+      <w:numFmt w:val="bullet"/>
+      <w:lvlText w:val=""/>
+      <w:lvlJc w:val="left"/>
+      <w:pPr>
+        <w:ind w:left="4320" w:hanging="360"/>
+      </w:pPr>
+      <w:rPr>
+        <w:rFonts w:ascii="Wingdings" w:hAnsi="Wingdings" w:hint="default"/>
+      </w:rPr>
+    </w:lvl>
+    <w:lvl w:ilvl="6" w:tplc="04090001" w:tentative="1">
+      <w:start w:val="1"/>
+      <w:numFmt w:val="bullet"/>
+      <w:lvlText w:val=""/>
+      <w:lvlJc w:val="left"/>
+      <w:pPr>
+        <w:ind w:left="5040" w:hanging="360"/>
+      </w:pPr>
+      <w:rPr>
+        <w:rFonts w:ascii="Symbol" w:hAnsi="Symbol" w:hint="default"/>
+      </w:rPr>
+    </w:lvl>
+    <w:lvl w:ilvl="7" w:tplc="04090003" w:tentative="1">
+      <w:start w:val="1"/>
+      <w:numFmt w:val="bullet"/>
+      <w:lvlText w:val="o"/>
+      <w:lvlJc w:val="left"/>
+      <w:pPr>
+        <w:ind w:left="5760" w:hanging="360"/>
+      </w:pPr>
+      <w:rPr>
+        <w:rFonts w:ascii="Courier New" w:hAnsi="Courier New" w:cs="Courier New" w:hint="default"/>
+      </w:rPr>
+    </w:lvl>
+    <w:lvl w:ilvl="8" w:tplc="04090005" w:tentative="1">
+      <w:start w:val="1"/>
+      <w:numFmt w:val="bullet"/>
+      <w:lvlText w:val=""/>
+      <w:lvlJc w:val="left"/>
+      <w:pPr>
+        <w:ind w:left="6480" w:hanging="360"/>
+      </w:pPr>
+      <w:rPr>
+        <w:rFonts w:ascii="Wingdings" w:hAnsi="Wingdings" w:hint="default"/>
+      </w:rPr>
+    </w:lvl>
+  </w:abstractNum>
   <w:num w:numId="1" w16cid:durableId="558174121">
     <w:abstractNumId w:val="0"/>
+  </w:num>
+  <w:num w:numId="2" w16cid:durableId="2092964037">
+    <w:abstractNumId w:val="1"/>
+  </w:num>
+  <w:num w:numId="3" w16cid:durableId="1365475025">
+    <w:abstractNumId w:val="2"/>
   </w:num>
 </w:numbering>
 </file>

</xml_diff>